<commit_message>
Correct v1.7 abstract metrics
Co-Authored-By: Claude Opus 5.5 <noreply@anthropic.com>
Claude-Session: https://claude.ai/code/session_01SDb44wgqXaibpjerVzN9dk
</commit_message>
<xml_diff>
--- a/manuscript_kais/DTTM_한국산학기술학회_수정내역서_v1.7_2026-10-31.docx
+++ b/manuscript_kais/DTTM_한국산학기술학회_수정내역서_v1.7_2026-10-31.docx
@@ -1116,7 +1116,7 @@
                 <w:rFonts w:ascii="Arial" w:hAnsi="Arial" w:eastAsia="맑은 고딕"/>
                 <w:sz w:val="18"/>
               </w:rPr>
-              <w:t>공백 포함 1,034자 / 공백 제외 807자, 12문장 (v1.6: 공백 제외 약 740자, 11문장)</w:t>
+              <w:t>공백 포함 1,034자 / 공백 제외 807자, 12문장 (v1.6: 공백 제외 740자, 11문장)</w:t>
             </w:r>
           </w:p>
         </w:tc>
@@ -1148,7 +1148,7 @@
                 <w:rFonts w:ascii="Arial" w:hAnsi="Arial" w:eastAsia="맑은 고딕"/>
                 <w:sz w:val="18"/>
               </w:rPr>
-              <w:t>313단어, 11문장 (v1.6: 약 285단어, 10문장)</w:t>
+              <w:t>313단어, 11문장 (v1.6: 283단어, 10문장)</w:t>
             </w:r>
           </w:p>
         </w:tc>

</xml_diff>